<commit_message>
fix: message d'erreur exploitable pour les migrations, et commandes de démarrage complètes
Le script de migration affichait « Migration interrompue — » suivi d'un message
vide quand PostgreSQL n'était pas joignable : impossible de savoir quoi faire.
Il identifie maintenant la cause (serveur arrêté ou absent, base inexistante,
identifiants refusés) et affiche la commande qui répare.

Corrige aussi les commandes de démarrage, qui omettaient la création de la base
de données et supposaient un shell Unix :
- README : création de la base ajoutée avant tout, variante Windows signalée
- fiche essentielle : séquence complète en trois blocs numérotés, commandes
  cmd Windows (copy au lieu de cp, antislashs dans les chemins)

Co-Authored-By: Claude Opus 5 <noreply@anthropic.com>
Claude-Session: https://claude.ai/code/session_01Updre4hiFZT8QYNR1DrVBm
</commit_message>
<xml_diff>
--- a/kayna-kayna-pay/docs/Kayna_Kayna_Pay_Essentiel.docx
+++ b/kayna-kayna-pay/docs/Kayna_Kayna_Pay_Essentiel.docx
@@ -52,7 +52,7 @@
     </w:p>
     <w:p>
       <w:pPr>
-        <w:spacing w:after="130" w:before="260"/>
+        <w:spacing w:after="110" w:before="210"/>
       </w:pPr>
       <w:r>
         <w:rPr>
@@ -116,7 +116,7 @@
     </w:p>
     <w:p>
       <w:pPr>
-        <w:spacing w:after="130" w:before="260"/>
+        <w:spacing w:after="110" w:before="210"/>
       </w:pPr>
       <w:r>
         <w:rPr>
@@ -498,7 +498,7 @@
     </w:p>
     <w:p>
       <w:pPr>
-        <w:spacing w:after="130" w:before="260"/>
+        <w:spacing w:after="110" w:before="210"/>
       </w:pPr>
       <w:r>
         <w:rPr>
@@ -900,7 +900,7 @@
     </w:p>
     <w:p>
       <w:pPr>
-        <w:spacing w:after="130" w:before="260"/>
+        <w:spacing w:after="110" w:before="210"/>
       </w:pPr>
       <w:r>
         <w:rPr>
@@ -1080,7 +1080,7 @@
     </w:p>
     <w:p>
       <w:pPr>
-        <w:spacing w:after="130" w:before="260"/>
+        <w:spacing w:after="110" w:before="210"/>
       </w:pPr>
       <w:r>
         <w:rPr>
@@ -1442,7 +1442,7 @@
     </w:p>
     <w:p>
       <w:pPr>
-        <w:spacing w:after="130" w:before="260"/>
+        <w:spacing w:after="110" w:before="210"/>
       </w:pPr>
       <w:r>
         <w:rPr>
@@ -1664,7 +1664,7 @@
     </w:tbl>
     <w:p>
       <w:pPr>
-        <w:spacing w:after="200" w:line="276"/>
+        <w:spacing w:after="110" w:line="276"/>
       </w:pPr>
       <w:r>
         <w:rPr>
@@ -1678,7 +1678,7 @@
     </w:p>
     <w:p>
       <w:pPr>
-        <w:spacing w:after="130" w:before="260"/>
+        <w:spacing w:after="110" w:before="210"/>
       </w:pPr>
       <w:r>
         <w:rPr>
@@ -1689,96 +1689,12 @@
           <w:sz w:val="24"/>
           <w:szCs w:val="24"/>
         </w:rPr>
-        <w:t xml:space="preserve">7.  Tester l'application (5 commandes)</w:t>
-      </w:r>
-    </w:p>
-    <w:p>
-      <w:pPr>
-        <w:spacing w:after="100" w:line="276"/>
-      </w:pPr>
-      <w:r>
-        <w:rPr>
-          <w:rFonts w:ascii="Calibri" w:cs="Calibri" w:eastAsia="Calibri" w:hAnsi="Calibri"/>
-          <w:color w:val="20344A"/>
-          <w:sz w:val="20"/>
-          <w:szCs w:val="20"/>
-        </w:rPr>
-        <w:t xml:space="preserve">Sur un ordinateur, téléphone et PC sur le même Wi-Fi :</w:t>
-      </w:r>
-    </w:p>
-    <w:p>
-      <w:pPr>
-        <w:shd w:fill="F2F6FA" w:val="clear"/>
-        <w:spacing w:after="60" w:line="260"/>
-      </w:pPr>
-      <w:r>
-        <w:rPr>
-          <w:rFonts w:ascii="Consolas" w:cs="Consolas" w:eastAsia="Consolas" w:hAnsi="Consolas"/>
-          <w:sz w:val="15"/>
-          <w:szCs w:val="15"/>
-        </w:rPr>
-        <w:t xml:space="preserve">git clone -b claude/kayna-kayna-pay-presentation-gp4lgf https://github.com/mly-dev/projet.git</w:t>
-      </w:r>
-    </w:p>
-    <w:p>
-      <w:pPr>
-        <w:shd w:fill="F2F6FA" w:val="clear"/>
-        <w:spacing w:after="60" w:line="260"/>
-      </w:pPr>
-      <w:r>
-        <w:rPr>
-          <w:rFonts w:ascii="Consolas" w:cs="Consolas" w:eastAsia="Consolas" w:hAnsi="Consolas"/>
-          <w:sz w:val="15"/>
-          <w:szCs w:val="15"/>
-        </w:rPr>
-        <w:t xml:space="preserve">cd projet/kayna-kayna-pay/plateforme</w:t>
-      </w:r>
-    </w:p>
-    <w:p>
-      <w:pPr>
-        <w:shd w:fill="F2F6FA" w:val="clear"/>
-        <w:spacing w:after="60" w:line="260"/>
-      </w:pPr>
-      <w:r>
-        <w:rPr>
-          <w:rFonts w:ascii="Consolas" w:cs="Consolas" w:eastAsia="Consolas" w:hAnsi="Consolas"/>
-          <w:sz w:val="15"/>
-          <w:szCs w:val="15"/>
-        </w:rPr>
-        <w:t xml:space="preserve">npm install &amp;&amp; npm run db:migrer &amp;&amp; npm run db:seed &amp;&amp; npm run dev</w:t>
-      </w:r>
-    </w:p>
-    <w:p>
-      <w:pPr>
-        <w:shd w:fill="F2F6FA" w:val="clear"/>
-        <w:spacing w:after="60" w:line="260"/>
-      </w:pPr>
-      <w:r>
-        <w:rPr>
-          <w:rFonts w:ascii="Consolas" w:cs="Consolas" w:eastAsia="Consolas" w:hAnsi="Consolas"/>
-          <w:sz w:val="15"/>
-          <w:szCs w:val="15"/>
-        </w:rPr>
-        <w:t xml:space="preserve">cd ../mobile &amp;&amp; npm install &amp;&amp; cp .env.example .env</w:t>
-      </w:r>
-    </w:p>
-    <w:p>
-      <w:pPr>
-        <w:shd w:fill="F2F6FA" w:val="clear"/>
-        <w:spacing w:after="130" w:line="260"/>
-      </w:pPr>
-      <w:r>
-        <w:rPr>
-          <w:rFonts w:ascii="Consolas" w:cs="Consolas" w:eastAsia="Consolas" w:hAnsi="Consolas"/>
-          <w:sz w:val="15"/>
-          <w:szCs w:val="15"/>
-        </w:rPr>
-        <w:t xml:space="preserve">npx expo start          (puis scanner le QR code avec Expo Go)</w:t>
-      </w:r>
-    </w:p>
-    <w:p>
-      <w:pPr>
-        <w:spacing w:after="200" w:line="276"/>
+        <w:t xml:space="preserve">7.  Tester l'application</w:t>
+      </w:r>
+    </w:p>
+    <w:p>
+      <w:pPr>
+        <w:spacing w:after="110" w:line="276"/>
       </w:pPr>
       <w:r>
         <w:rPr>
@@ -1789,16 +1705,16 @@
           <w:sz w:val="20"/>
           <w:szCs w:val="20"/>
         </w:rPr>
-        <w:t xml:space="preserve">Important : </w:t>
-      </w:r>
-      <w:r>
-        <w:rPr>
-          <w:rFonts w:ascii="Calibri" w:cs="Calibri" w:eastAsia="Calibri" w:hAnsi="Calibri"/>
-          <w:color w:val="20344A"/>
-          <w:sz w:val="20"/>
-          <w:szCs w:val="20"/>
-        </w:rPr>
-        <w:t xml:space="preserve">dans </w:t>
+        <w:t xml:space="preserve">Prérequis : </w:t>
+      </w:r>
+      <w:r>
+        <w:rPr>
+          <w:rFonts w:ascii="Calibri" w:cs="Calibri" w:eastAsia="Calibri" w:hAnsi="Calibri"/>
+          <w:color w:val="20344A"/>
+          <w:sz w:val="20"/>
+          <w:szCs w:val="20"/>
+        </w:rPr>
+        <w:t xml:space="preserve">Node 18+, PostgreSQL installé </w:t>
       </w:r>
       <w:r>
         <w:rPr>
@@ -1809,22 +1725,250 @@
           <w:sz w:val="20"/>
           <w:szCs w:val="20"/>
         </w:rPr>
-        <w:t xml:space="preserve">mobile/.env</w:t>
-      </w:r>
-      <w:r>
-        <w:rPr>
-          <w:rFonts w:ascii="Calibri" w:cs="Calibri" w:eastAsia="Calibri" w:hAnsi="Calibri"/>
-          <w:color w:val="20344A"/>
-          <w:sz w:val="20"/>
-          <w:szCs w:val="20"/>
-        </w:rPr>
-        <w:t xml:space="preserve">, mettez l'adresse IP de votre PC (</w:t>
-      </w:r>
+        <w:t xml:space="preserve">et démarré</w:t>
+      </w:r>
+      <w:r>
+        <w:rPr>
+          <w:rFonts w:ascii="Calibri" w:cs="Calibri" w:eastAsia="Calibri" w:hAnsi="Calibri"/>
+          <w:color w:val="20344A"/>
+          <w:sz w:val="20"/>
+          <w:szCs w:val="20"/>
+        </w:rPr>
+        <w:t xml:space="preserve">, Expo Go sur le téléphone, PC et téléphone sur le même Wi-Fi. Commandes pour Windows (cmd).</w:t>
+      </w:r>
+    </w:p>
+    <w:p>
+      <w:pPr>
+        <w:spacing w:after="60" w:line="276"/>
+      </w:pPr>
       <w:r>
         <w:rPr>
           <w:rFonts w:ascii="Calibri" w:cs="Calibri" w:eastAsia="Calibri" w:hAnsi="Calibri"/>
           <w:b/>
           <w:bCs/>
+          <w:color w:val="003A70"/>
+          <w:sz w:val="20"/>
+          <w:szCs w:val="20"/>
+        </w:rPr>
+        <w:t xml:space="preserve">① La base de données — une seule fois</w:t>
+      </w:r>
+    </w:p>
+    <w:p>
+      <w:pPr>
+        <w:shd w:fill="F2F6FA" w:val="clear"/>
+        <w:spacing w:after="40" w:line="250"/>
+      </w:pPr>
+      <w:r>
+        <w:rPr>
+          <w:rFonts w:ascii="Consolas" w:cs="Consolas" w:eastAsia="Consolas" w:hAnsi="Consolas"/>
+          <w:color w:val="20344A"/>
+          <w:sz w:val="14"/>
+          <w:szCs w:val="14"/>
+        </w:rPr>
+        <w:t xml:space="preserve">  psql -U postgres -c "CREATE USER kkp WITH PASSWORD 'kkp' CREATEDB;"</w:t>
+      </w:r>
+    </w:p>
+    <w:p>
+      <w:pPr>
+        <w:shd w:fill="F2F6FA" w:val="clear"/>
+        <w:spacing w:after="110" w:line="250"/>
+      </w:pPr>
+      <w:r>
+        <w:rPr>
+          <w:rFonts w:ascii="Consolas" w:cs="Consolas" w:eastAsia="Consolas" w:hAnsi="Consolas"/>
+          <w:color w:val="20344A"/>
+          <w:sz w:val="14"/>
+          <w:szCs w:val="14"/>
+        </w:rPr>
+        <w:t xml:space="preserve">  psql -U postgres -c "CREATE DATABASE kaynakaynapay OWNER kkp;"</w:t>
+      </w:r>
+    </w:p>
+    <w:p>
+      <w:pPr>
+        <w:spacing w:after="60" w:line="276"/>
+      </w:pPr>
+      <w:r>
+        <w:rPr>
+          <w:rFonts w:ascii="Calibri" w:cs="Calibri" w:eastAsia="Calibri" w:hAnsi="Calibri"/>
+          <w:b/>
+          <w:bCs/>
+          <w:color w:val="003A70"/>
+          <w:sz w:val="20"/>
+          <w:szCs w:val="20"/>
+        </w:rPr>
+        <w:t xml:space="preserve">② La plateforme</w:t>
+      </w:r>
+    </w:p>
+    <w:p>
+      <w:pPr>
+        <w:shd w:fill="F2F6FA" w:val="clear"/>
+        <w:spacing w:after="40" w:line="250"/>
+      </w:pPr>
+      <w:r>
+        <w:rPr>
+          <w:rFonts w:ascii="Consolas" w:cs="Consolas" w:eastAsia="Consolas" w:hAnsi="Consolas"/>
+          <w:color w:val="20344A"/>
+          <w:sz w:val="14"/>
+          <w:szCs w:val="14"/>
+        </w:rPr>
+        <w:t xml:space="preserve">  git clone -b claude/kayna-kayna-pay-presentation-gp4lgf https://github.com/mly-dev/projet.git</w:t>
+      </w:r>
+    </w:p>
+    <w:p>
+      <w:pPr>
+        <w:shd w:fill="F2F6FA" w:val="clear"/>
+        <w:spacing w:after="40" w:line="250"/>
+      </w:pPr>
+      <w:r>
+        <w:rPr>
+          <w:rFonts w:ascii="Consolas" w:cs="Consolas" w:eastAsia="Consolas" w:hAnsi="Consolas"/>
+          <w:color w:val="20344A"/>
+          <w:sz w:val="14"/>
+          <w:szCs w:val="14"/>
+        </w:rPr>
+        <w:t xml:space="preserve">  cd projet\kayna-kayna-pay\plateforme</w:t>
+      </w:r>
+    </w:p>
+    <w:p>
+      <w:pPr>
+        <w:shd w:fill="F2F6FA" w:val="clear"/>
+        <w:spacing w:after="40" w:line="250"/>
+      </w:pPr>
+      <w:r>
+        <w:rPr>
+          <w:rFonts w:ascii="Consolas" w:cs="Consolas" w:eastAsia="Consolas" w:hAnsi="Consolas"/>
+          <w:color w:val="20344A"/>
+          <w:sz w:val="14"/>
+          <w:szCs w:val="14"/>
+        </w:rPr>
+        <w:t xml:space="preserve">  copy .env.example .env</w:t>
+      </w:r>
+    </w:p>
+    <w:p>
+      <w:pPr>
+        <w:shd w:fill="F2F6FA" w:val="clear"/>
+        <w:spacing w:after="110" w:line="250"/>
+      </w:pPr>
+      <w:r>
+        <w:rPr>
+          <w:rFonts w:ascii="Consolas" w:cs="Consolas" w:eastAsia="Consolas" w:hAnsi="Consolas"/>
+          <w:color w:val="20344A"/>
+          <w:sz w:val="14"/>
+          <w:szCs w:val="14"/>
+        </w:rPr>
+        <w:t xml:space="preserve">  npm install &amp;&amp; npm run db:migrer &amp;&amp; npm run db:seed &amp;&amp; npm run dev</w:t>
+      </w:r>
+    </w:p>
+    <w:p>
+      <w:pPr>
+        <w:spacing w:after="60" w:line="276"/>
+      </w:pPr>
+      <w:r>
+        <w:rPr>
+          <w:rFonts w:ascii="Calibri" w:cs="Calibri" w:eastAsia="Calibri" w:hAnsi="Calibri"/>
+          <w:b/>
+          <w:bCs/>
+          <w:color w:val="003A70"/>
+          <w:sz w:val="20"/>
+          <w:szCs w:val="20"/>
+        </w:rPr>
+        <w:t xml:space="preserve">③ L'application mobile — dans une 2ᵉ fenêtre</w:t>
+      </w:r>
+    </w:p>
+    <w:p>
+      <w:pPr>
+        <w:shd w:fill="F2F6FA" w:val="clear"/>
+        <w:spacing w:after="40" w:line="250"/>
+      </w:pPr>
+      <w:r>
+        <w:rPr>
+          <w:rFonts w:ascii="Consolas" w:cs="Consolas" w:eastAsia="Consolas" w:hAnsi="Consolas"/>
+          <w:color w:val="20344A"/>
+          <w:sz w:val="14"/>
+          <w:szCs w:val="14"/>
+        </w:rPr>
+        <w:t xml:space="preserve">  cd projet\kayna-kayna-pay\mobile</w:t>
+      </w:r>
+    </w:p>
+    <w:p>
+      <w:pPr>
+        <w:shd w:fill="F2F6FA" w:val="clear"/>
+        <w:spacing w:after="40" w:line="250"/>
+      </w:pPr>
+      <w:r>
+        <w:rPr>
+          <w:rFonts w:ascii="Consolas" w:cs="Consolas" w:eastAsia="Consolas" w:hAnsi="Consolas"/>
+          <w:color w:val="20344A"/>
+          <w:sz w:val="14"/>
+          <w:szCs w:val="14"/>
+        </w:rPr>
+        <w:t xml:space="preserve">  copy .env.example .env</w:t>
+      </w:r>
+    </w:p>
+    <w:p>
+      <w:pPr>
+        <w:shd w:fill="F2F6FA" w:val="clear"/>
+        <w:spacing w:after="110" w:line="250"/>
+      </w:pPr>
+      <w:r>
+        <w:rPr>
+          <w:rFonts w:ascii="Consolas" w:cs="Consolas" w:eastAsia="Consolas" w:hAnsi="Consolas"/>
+          <w:color w:val="20344A"/>
+          <w:sz w:val="14"/>
+          <w:szCs w:val="14"/>
+        </w:rPr>
+        <w:t xml:space="preserve">  npm install &amp;&amp; npx expo start</w:t>
+      </w:r>
+    </w:p>
+    <w:p>
+      <w:pPr>
+        <w:spacing w:after="70" w:line="276"/>
+      </w:pPr>
+      <w:r>
+        <w:rPr>
+          <w:rFonts w:ascii="Calibri" w:cs="Calibri" w:eastAsia="Calibri" w:hAnsi="Calibri"/>
+          <w:b/>
+          <w:bCs/>
+          <w:color w:val="20344A"/>
+          <w:sz w:val="20"/>
+          <w:szCs w:val="20"/>
+        </w:rPr>
+        <w:t xml:space="preserve">Avant de lancer Expo : </w:t>
+      </w:r>
+      <w:r>
+        <w:rPr>
+          <w:rFonts w:ascii="Calibri" w:cs="Calibri" w:eastAsia="Calibri" w:hAnsi="Calibri"/>
+          <w:color w:val="20344A"/>
+          <w:sz w:val="20"/>
+          <w:szCs w:val="20"/>
+        </w:rPr>
+        <w:t xml:space="preserve">ouvrez </w:t>
+      </w:r>
+      <w:r>
+        <w:rPr>
+          <w:rFonts w:ascii="Calibri" w:cs="Calibri" w:eastAsia="Calibri" w:hAnsi="Calibri"/>
+          <w:b/>
+          <w:bCs/>
+          <w:color w:val="20344A"/>
+          <w:sz w:val="20"/>
+          <w:szCs w:val="20"/>
+        </w:rPr>
+        <w:t xml:space="preserve">mobile\.env</w:t>
+      </w:r>
+      <w:r>
+        <w:rPr>
+          <w:rFonts w:ascii="Calibri" w:cs="Calibri" w:eastAsia="Calibri" w:hAnsi="Calibri"/>
+          <w:color w:val="20344A"/>
+          <w:sz w:val="20"/>
+          <w:szCs w:val="20"/>
+        </w:rPr>
+        <w:t xml:space="preserve"> et remplacez l'adresse par l'IP de votre PC (commande </w:t>
+      </w:r>
+      <w:r>
+        <w:rPr>
+          <w:rFonts w:ascii="Calibri" w:cs="Calibri" w:eastAsia="Calibri" w:hAnsi="Calibri"/>
+          <w:b/>
+          <w:bCs/>
           <w:color w:val="20344A"/>
           <w:sz w:val="20"/>
           <w:szCs w:val="20"/>
@@ -1838,7 +1982,32 @@
           <w:sz w:val="20"/>
           <w:szCs w:val="20"/>
         </w:rPr>
-        <w:t xml:space="preserve"> sous Windows), pas « localhost ». Les codes SMS s'affichent dans le terminal de la plateforme.</w:t>
+        <w:t xml:space="preserve">, ligne « Adresse IPv4 » du Wi-Fi). « localhost » ne marche pas depuis un téléphone.</w:t>
+      </w:r>
+    </w:p>
+    <w:p>
+      <w:pPr>
+        <w:spacing w:after="30" w:line="276"/>
+      </w:pPr>
+      <w:r>
+        <w:rPr>
+          <w:rFonts w:ascii="Calibri" w:cs="Calibri" w:eastAsia="Calibri" w:hAnsi="Calibri"/>
+          <w:b/>
+          <w:bCs/>
+          <w:color w:val="20344A"/>
+          <w:sz w:val="20"/>
+          <w:szCs w:val="20"/>
+        </w:rPr>
+        <w:t xml:space="preserve">Les codes SMS </w:t>
+      </w:r>
+      <w:r>
+        <w:rPr>
+          <w:rFonts w:ascii="Calibri" w:cs="Calibri" w:eastAsia="Calibri" w:hAnsi="Calibri"/>
+          <w:color w:val="20344A"/>
+          <w:sz w:val="20"/>
+          <w:szCs w:val="20"/>
+        </w:rPr>
+        <w:t xml:space="preserve">s'affichent dans la fenêtre de la plateforme (lignes « [SMS → +227… ] »), pas sur un vrai téléphone.</w:t>
       </w:r>
     </w:p>
     <w:p>
@@ -1846,19 +2015,7 @@
         <w:pBdr>
           <w:top w:val="single" w:color="D7E3EE" w:sz="6"/>
         </w:pBdr>
-        <w:spacing w:after="60" w:before="200"/>
-      </w:pPr>
-      <w:r>
-        <w:rPr>
-          <w:sz w:val="4"/>
-          <w:szCs w:val="4"/>
-        </w:rPr>
-        <w:t xml:space="preserve"/>
-      </w:r>
-    </w:p>
-    <w:p>
-      <w:pPr>
-        <w:spacing w:after="0" w:line="276"/>
+        <w:spacing w:after="0" w:before="130" w:line="240"/>
       </w:pPr>
       <w:r>
         <w:rPr>
@@ -1867,7 +2024,7 @@
           <w:sz w:val="16"/>
           <w:szCs w:val="16"/>
         </w:rPr>
-        <w:t xml:space="preserve">Guide détaillé, documentation technique et procédure d'exploitation : dossier </w:t>
+        <w:t xml:space="preserve">Guide détaillé et documentation technique : dossier </w:t>
       </w:r>
       <w:r>
         <w:rPr>
@@ -1887,12 +2044,12 @@
           <w:sz w:val="16"/>
           <w:szCs w:val="16"/>
         </w:rPr>
-        <w:t xml:space="preserve"> du projet. Chiffres relevés dans le code, pas estimés.</w:t>
+        <w:t xml:space="preserve"> du projet.</w:t>
       </w:r>
     </w:p>
     <w:sectPr>
       <w:pgSz w:w="11906" w:h="16838" w:orient="portrait"/>
-      <w:pgMar w:top="900" w:right="1000" w:bottom="800" w:left="1000" w:header="708" w:footer="708" w:gutter="0"/>
+      <w:pgMar w:top="850" w:right="1000" w:bottom="560" w:left="1000" w:header="708" w:footer="708" w:gutter="0"/>
       <w:pgNumType/>
       <w:docGrid w:linePitch="360"/>
     </w:sectPr>

</xml_diff>